<commit_message>
Manual: add Relics section (shrine relics, origin relics, Relic Shrines)
Co-Authored-By: Claude Sonnet 5.5 <noreply@anthropic.com>
Claude-Session: https://claude.ai/code/session_01KgZN88s8x8Wc56ZgczSzak
</commit_message>
<xml_diff>
--- a/DS_-_Manual.docx
+++ b/DS_-_Manual.docx
@@ -7736,6 +7736,416 @@
           <w:rtl w:val="0"/>
         </w:rPr>
       </w:r>
+    </w:p>
+    <w:p>
+      <w:pPr>
+        <w:pStyle w:val="Heading3"/>
+        <w:ind w:left="360" w:right="390" w:firstLine="0"/>
+      </w:pPr>
+      <w:r>
+        <w:rPr>
+          <w:rtl w:val="0"/>
+        </w:rPr>
+        <w:t xml:space="preserve">Relics</w:t>
+      </w:r>
+    </w:p>
+    <w:p>
+      <w:pPr>
+        <w:rPr/>
+      </w:pPr>
+    </w:p>
+    <w:p>
+      <w:pPr>
+        <w:ind w:left="360" w:right="390" w:firstLine="0"/>
+      </w:pPr>
+      <w:r>
+        <w:rPr>
+          <w:b w:val="1"/>
+          <w:bCs w:val="1"/>
+          <w:rtl w:val="0"/>
+        </w:rPr>
+        <w:t xml:space="preserve">Digital edition rule. </w:t>
+      </w:r>
+      <w:r>
+        <w:rPr>
+          <w:rtl w:val="0"/>
+        </w:rPr>
+        <w:t xml:space="preserve">Relics are permanent passive perks that last for the rest of a run. Unlike Dice, they take no space in the Tray and are never lost, swapped, or placed in the Back Pocket. A run can hold any number of Relics, and the same Relic is never gained twice in one run.</w:t>
+      </w:r>
+    </w:p>
+    <w:p>
+      <w:pPr>
+        <w:rPr/>
+      </w:pPr>
+    </w:p>
+    <w:p>
+      <w:pPr>
+        <w:ind w:left="360" w:right="390" w:firstLine="0"/>
+      </w:pPr>
+      <w:r>
+        <w:rPr>
+          <w:b w:val="1"/>
+          <w:bCs w:val="1"/>
+          <w:rtl w:val="0"/>
+        </w:rPr>
+        <w:t xml:space="preserve">Relic Shrines. </w:t>
+      </w:r>
+      <w:r>
+        <w:rPr>
+          <w:rtl w:val="0"/>
+        </w:rPr>
+        <w:t xml:space="preserve">Some Shrines (Department Spore and Storied Emporium) offer Relics instead of a Loot Die or upgrade. When the Adventurers reach one, draw 3 different Relics they do not already hold from the Shrine Relic list below. The Adventurers choose 1 to keep.</w:t>
+      </w:r>
+    </w:p>
+    <w:p>
+      <w:pPr>
+        <w:rPr/>
+      </w:pPr>
+    </w:p>
+    <w:p>
+      <w:pPr>
+        <w:ind w:left="360" w:right="390" w:firstLine="0"/>
+      </w:pPr>
+      <w:r>
+        <w:rPr>
+          <w:b w:val="1"/>
+          <w:bCs w:val="1"/>
+          <w:rtl w:val="0"/>
+        </w:rPr>
+        <w:t xml:space="preserve">Origin Relics. </w:t>
+      </w:r>
+      <w:r>
+        <w:rPr>
+          <w:rtl w:val="0"/>
+        </w:rPr>
+        <w:t xml:space="preserve">Each Origin has one signature Relic, which is never offered at Shrines. After the Adventurers win a full run (defeat the Big Boss) with an Origin, every later Adventurer of that Origin begins the run already holding its Origin Relic.</w:t>
+      </w:r>
+    </w:p>
+    <w:p>
+      <w:pPr>
+        <w:rPr/>
+      </w:pPr>
+    </w:p>
+    <w:p>
+      <w:pPr>
+        <w:ind w:left="360" w:right="390" w:firstLine="0"/>
+      </w:pPr>
+      <w:r>
+        <w:rPr>
+          <w:b w:val="1"/>
+          <w:bCs w:val="1"/>
+          <w:rtl w:val="0"/>
+        </w:rPr>
+        <w:t xml:space="preserve">Shrine Relics</w:t>
+      </w:r>
+    </w:p>
+    <w:p>
+      <w:pPr>
+        <w:ind w:left="360" w:right="390" w:firstLine="0"/>
+      </w:pPr>
+      <w:r>
+        <w:rPr>
+          <w:b w:val="1"/>
+          <w:bCs w:val="1"/>
+          <w:rtl w:val="0"/>
+        </w:rPr>
+        <w:t xml:space="preserve">Whetstone: </w:t>
+      </w:r>
+      <w:r>
+        <w:rPr>
+          <w:rtl w:val="0"/>
+        </w:rPr>
+        <w:t xml:space="preserve">Your first Hit each turn deals +2 damage.</w:t>
+      </w:r>
+    </w:p>
+    <w:p>
+      <w:pPr>
+        <w:ind w:left="360" w:right="390" w:firstLine="0"/>
+      </w:pPr>
+      <w:r>
+        <w:rPr>
+          <w:b w:val="1"/>
+          <w:bCs w:val="1"/>
+          <w:rtl w:val="0"/>
+        </w:rPr>
+        <w:t xml:space="preserve">Iron Rations: </w:t>
+      </w:r>
+      <w:r>
+        <w:rPr>
+          <w:rtl w:val="0"/>
+        </w:rPr>
+        <w:t xml:space="preserve">Heal 2 after every victory.</w:t>
+      </w:r>
+    </w:p>
+    <w:p>
+      <w:pPr>
+        <w:ind w:left="360" w:right="390" w:firstLine="0"/>
+      </w:pPr>
+      <w:r>
+        <w:rPr>
+          <w:b w:val="1"/>
+          <w:bCs w:val="1"/>
+          <w:rtl w:val="0"/>
+        </w:rPr>
+        <w:t xml:space="preserve">Padded Gambeson: </w:t>
+      </w:r>
+      <w:r>
+        <w:rPr>
+          <w:rtl w:val="0"/>
+        </w:rPr>
+        <w:t xml:space="preserve">Every enemy attack deals 1 less damage.</w:t>
+      </w:r>
+    </w:p>
+    <w:p>
+      <w:pPr>
+        <w:ind w:left="360" w:right="390" w:firstLine="0"/>
+      </w:pPr>
+      <w:r>
+        <w:rPr>
+          <w:b w:val="1"/>
+          <w:bCs w:val="1"/>
+          <w:rtl w:val="0"/>
+        </w:rPr>
+        <w:t xml:space="preserve">Lucky Coin: </w:t>
+      </w:r>
+      <w:r>
+        <w:rPr>
+          <w:rtl w:val="0"/>
+        </w:rPr>
+        <w:t xml:space="preserve">Loot rewards offer +1 die to choose from.</w:t>
+      </w:r>
+    </w:p>
+    <w:p>
+      <w:pPr>
+        <w:ind w:left="360" w:right="390" w:firstLine="0"/>
+      </w:pPr>
+      <w:r>
+        <w:rPr>
+          <w:b w:val="1"/>
+          <w:bCs w:val="1"/>
+          <w:rtl w:val="0"/>
+        </w:rPr>
+        <w:t xml:space="preserve">Campfire Kettle: </w:t>
+      </w:r>
+      <w:r>
+        <w:rPr>
+          <w:rtl w:val="0"/>
+        </w:rPr>
+        <w:t xml:space="preserve">Resting at Camp heals 3 extra.</w:t>
+      </w:r>
+    </w:p>
+    <w:p>
+      <w:pPr>
+        <w:ind w:left="360" w:right="390" w:firstLine="0"/>
+      </w:pPr>
+      <w:r>
+        <w:rPr>
+          <w:b w:val="1"/>
+          <w:bCs w:val="1"/>
+          <w:rtl w:val="0"/>
+        </w:rPr>
+        <w:t xml:space="preserve">Vanguard Banner: </w:t>
+      </w:r>
+      <w:r>
+        <w:rPr>
+          <w:rtl w:val="0"/>
+        </w:rPr>
+        <w:t xml:space="preserve">Start every fight with 3 Block.</w:t>
+      </w:r>
+    </w:p>
+    <w:p>
+      <w:pPr>
+        <w:ind w:left="360" w:right="390" w:firstLine="0"/>
+      </w:pPr>
+      <w:r>
+        <w:rPr>
+          <w:b w:val="1"/>
+          <w:bCs w:val="1"/>
+          <w:rtl w:val="0"/>
+        </w:rPr>
+        <w:t xml:space="preserve">Bottomless Flask: </w:t>
+      </w:r>
+      <w:r>
+        <w:rPr>
+          <w:rtl w:val="0"/>
+        </w:rPr>
+        <w:t xml:space="preserve">+8 maximum health, immediately.</w:t>
+      </w:r>
+    </w:p>
+    <w:p>
+      <w:pPr>
+        <w:ind w:left="360" w:right="390" w:firstLine="0"/>
+      </w:pPr>
+      <w:r>
+        <w:rPr>
+          <w:b w:val="1"/>
+          <w:bCs w:val="1"/>
+          <w:rtl w:val="0"/>
+        </w:rPr>
+        <w:t xml:space="preserve">Echo Chime: </w:t>
+      </w:r>
+      <w:r>
+        <w:rPr>
+          <w:rtl w:val="0"/>
+        </w:rPr>
+        <w:t xml:space="preserve">A Path of 5 or more dice deals +3 damage.</w:t>
+      </w:r>
+    </w:p>
+    <w:p>
+      <w:pPr>
+        <w:ind w:left="360" w:right="390" w:firstLine="0"/>
+      </w:pPr>
+      <w:r>
+        <w:rPr>
+          <w:b w:val="1"/>
+          <w:bCs w:val="1"/>
+          <w:rtl w:val="0"/>
+        </w:rPr>
+        <w:t xml:space="preserve">Venom Vial: </w:t>
+      </w:r>
+      <w:r>
+        <w:rPr>
+          <w:rtl w:val="0"/>
+        </w:rPr>
+        <w:t xml:space="preserve">Every D.O.T. face you play adds +1 D.O.T.</w:t>
+      </w:r>
+    </w:p>
+    <w:p>
+      <w:pPr>
+        <w:ind w:left="360" w:right="390" w:firstLine="0"/>
+      </w:pPr>
+      <w:r>
+        <w:rPr>
+          <w:b w:val="1"/>
+          <w:bCs w:val="1"/>
+          <w:rtl w:val="0"/>
+        </w:rPr>
+        <w:t xml:space="preserve">Hungry Blade: </w:t>
+      </w:r>
+      <w:r>
+        <w:rPr>
+          <w:rtl w:val="0"/>
+        </w:rPr>
+        <w:t xml:space="preserve">Overkill triggers at 6 extra damage instead of 10.</w:t>
+      </w:r>
+    </w:p>
+    <w:p>
+      <w:pPr>
+        <w:ind w:left="360" w:right="390" w:firstLine="0"/>
+      </w:pPr>
+      <w:r>
+        <w:rPr>
+          <w:b w:val="1"/>
+          <w:bCs w:val="1"/>
+          <w:rtl w:val="0"/>
+        </w:rPr>
+        <w:t xml:space="preserve">Tincture Kit: </w:t>
+      </w:r>
+      <w:r>
+        <w:rPr>
+          <w:rtl w:val="0"/>
+        </w:rPr>
+        <w:t xml:space="preserve">Every Heal face you play heals +1.</w:t>
+      </w:r>
+    </w:p>
+    <w:p>
+      <w:pPr>
+        <w:rPr/>
+      </w:pPr>
+    </w:p>
+    <w:p>
+      <w:pPr>
+        <w:ind w:left="360" w:right="390" w:firstLine="0"/>
+      </w:pPr>
+      <w:r>
+        <w:rPr>
+          <w:b w:val="1"/>
+          <w:bCs w:val="1"/>
+          <w:rtl w:val="0"/>
+        </w:rPr>
+        <w:t xml:space="preserve">Origin Relics</w:t>
+      </w:r>
+    </w:p>
+    <w:p>
+      <w:pPr>
+        <w:ind w:left="360" w:right="390" w:firstLine="0"/>
+      </w:pPr>
+      <w:r>
+        <w:rPr>
+          <w:b w:val="1"/>
+          <w:bCs w:val="1"/>
+          <w:rtl w:val="0"/>
+        </w:rPr>
+        <w:t xml:space="preserve">Forgeplate (Dwarf): </w:t>
+      </w:r>
+      <w:r>
+        <w:rPr>
+          <w:rtl w:val="0"/>
+        </w:rPr>
+        <w:t xml:space="preserve">Start every fight with 5 Block.</w:t>
+      </w:r>
+    </w:p>
+    <w:p>
+      <w:pPr>
+        <w:ind w:left="360" w:right="390" w:firstLine="0"/>
+      </w:pPr>
+      <w:r>
+        <w:rPr>
+          <w:b w:val="1"/>
+          <w:bCs w:val="1"/>
+          <w:rtl w:val="0"/>
+        </w:rPr>
+        <w:t xml:space="preserve">Spore Satchel (Gnome): </w:t>
+      </w:r>
+      <w:r>
+        <w:rPr>
+          <w:rtl w:val="0"/>
+        </w:rPr>
+        <w:t xml:space="preserve">Leech faces also add +2 D.O.T. and heal +1 more.</w:t>
+      </w:r>
+    </w:p>
+    <w:p>
+      <w:pPr>
+        <w:ind w:left="360" w:right="390" w:firstLine="0"/>
+      </w:pPr>
+      <w:r>
+        <w:rPr>
+          <w:b w:val="1"/>
+          <w:bCs w:val="1"/>
+          <w:rtl w:val="0"/>
+        </w:rPr>
+        <w:t xml:space="preserve">Picnic Basket (Halfling): </w:t>
+      </w:r>
+      <w:r>
+        <w:rPr>
+          <w:rtl w:val="0"/>
+        </w:rPr>
+        <w:t xml:space="preserve">Heal faces heal +2 and H.O.T. faces add +1 H.O.T.</w:t>
+      </w:r>
+    </w:p>
+    <w:p>
+      <w:pPr>
+        <w:ind w:left="360" w:right="390" w:firstLine="0"/>
+      </w:pPr>
+      <w:r>
+        <w:rPr>
+          <w:b w:val="1"/>
+          <w:bCs w:val="1"/>
+          <w:rtl w:val="0"/>
+        </w:rPr>
+        <w:t xml:space="preserve">Glimmer Dust (Pixie): </w:t>
+      </w:r>
+      <w:r>
+        <w:rPr>
+          <w:rtl w:val="0"/>
+        </w:rPr>
+        <w:t xml:space="preserve">Each Dodge, Leap or Pivot in your Path adds +1 damage to its last damaging die.</w:t>
+      </w:r>
+    </w:p>
+    <w:p>
+      <w:pPr>
+        <w:rPr/>
+      </w:pPr>
     </w:p>
     <w:p>
       <w:pPr>

</xml_diff>

<commit_message>
Manual: add Digital Edition progression and run-records section
Co-Authored-By: Claude Sonnet 5.5 <noreply@anthropic.com>
Claude-Session: https://claude.ai/code/session_01KgZN88s8x8Wc56ZgczSzak
</commit_message>
<xml_diff>
--- a/DS_-_Manual.docx
+++ b/DS_-_Manual.docx
@@ -15442,6 +15442,239 @@
         </w:rPr>
         <w:t xml:space="preserve">.  Sometimes you need a real long rest!</w:t>
       </w:r>
+    </w:p>
+    <w:p>
+      <w:pPr>
+        <w:pStyle w:val="Heading2"/>
+        <w:ind w:left="-360" w:right="-285" w:firstLine="0"/>
+      </w:pPr>
+      <w:r>
+        <w:rPr>
+          <w:rtl w:val="0"/>
+        </w:rPr>
+        <w:t xml:space="preserve">Digital Edition: Progression</w:t>
+      </w:r>
+    </w:p>
+    <w:p>
+      <w:pPr>
+        <w:rPr/>
+      </w:pPr>
+    </w:p>
+    <w:p>
+      <w:pPr>
+        <w:ind w:left="360" w:right="390" w:firstLine="0"/>
+      </w:pPr>
+      <w:r>
+        <w:rPr>
+          <w:b w:val="1"/>
+          <w:bCs w:val="1"/>
+          <w:rtl w:val="0"/>
+        </w:rPr>
+        <w:t xml:space="preserve">Digital edition rule. </w:t>
+      </w:r>
+      <w:r>
+        <w:rPr>
+          <w:rtl w:val="0"/>
+        </w:rPr>
+        <w:t xml:space="preserve">The video game keeps a record of every run across sessions. None of the systems below change how a turn is played; they decide what a new Adventurer can start with, and they celebrate what happened on the way.</w:t>
+      </w:r>
+    </w:p>
+    <w:p>
+      <w:pPr>
+        <w:rPr/>
+      </w:pPr>
+    </w:p>
+    <w:p>
+      <w:pPr>
+        <w:ind w:left="360" w:right="390" w:firstLine="0"/>
+      </w:pPr>
+      <w:r>
+        <w:rPr>
+          <w:b w:val="1"/>
+          <w:bCs w:val="1"/>
+          <w:rtl w:val="0"/>
+        </w:rPr>
+        <w:t xml:space="preserve">Unlocking Origins. </w:t>
+      </w:r>
+      <w:r>
+        <w:rPr>
+          <w:rtl w:val="0"/>
+        </w:rPr>
+        <w:t xml:space="preserve">Dwarf and Gnome are available from the first run. Halfling unlocks after the Adventurers win a full run (defeat the Big Boss) with any Origin. Pixie unlocks once the player has won full runs with two different Origins.</w:t>
+      </w:r>
+    </w:p>
+    <w:p>
+      <w:pPr>
+        <w:rPr/>
+      </w:pPr>
+    </w:p>
+    <w:p>
+      <w:pPr>
+        <w:ind w:left="360" w:right="390" w:firstLine="0"/>
+      </w:pPr>
+      <w:r>
+        <w:rPr>
+          <w:b w:val="1"/>
+          <w:bCs w:val="1"/>
+          <w:rtl w:val="0"/>
+        </w:rPr>
+        <w:t xml:space="preserve">Origin Relics. </w:t>
+      </w:r>
+      <w:r>
+        <w:rPr>
+          <w:rtl w:val="0"/>
+        </w:rPr>
+        <w:t xml:space="preserve">The first full-run win with an Origin earns that Origin's signature Relic (see Relics). The victory screen announces it, and from then on every new Adventurer of that Origin begins the run holding it. Until it is earned, the Origin's page on the Adventurer Creation screen shows its Relic as a locked, mystery slot.</w:t>
+      </w:r>
+    </w:p>
+    <w:p>
+      <w:pPr>
+        <w:rPr/>
+      </w:pPr>
+    </w:p>
+    <w:p>
+      <w:pPr>
+        <w:ind w:left="360" w:right="390" w:firstLine="0"/>
+      </w:pPr>
+      <w:r>
+        <w:rPr>
+          <w:b w:val="1"/>
+          <w:bCs w:val="1"/>
+          <w:rtl w:val="0"/>
+        </w:rPr>
+        <w:t xml:space="preserve">Starting Boons. </w:t>
+      </w:r>
+      <w:r>
+        <w:rPr>
+          <w:rtl w:val="0"/>
+        </w:rPr>
+        <w:t xml:space="preserve">At Adventurer Creation, a player may swap their first Maneuver Die I for a Loot Die they have already discovered (seen as a loot choice in any past run). Alloy dice become available after the first win, Gilded dice after reaching Floor 3 in any run, and Magic dice after the player has won with every Origin.</w:t>
+      </w:r>
+    </w:p>
+    <w:p>
+      <w:pPr>
+        <w:rPr/>
+      </w:pPr>
+    </w:p>
+    <w:p>
+      <w:pPr>
+        <w:ind w:left="360" w:right="390" w:firstLine="0"/>
+      </w:pPr>
+      <w:r>
+        <w:rPr>
+          <w:b w:val="1"/>
+          <w:bCs w:val="1"/>
+          <w:rtl w:val="0"/>
+        </w:rPr>
+        <w:t xml:space="preserve">Carrying a die after defeat. </w:t>
+      </w:r>
+      <w:r>
+        <w:rPr>
+          <w:rtl w:val="0"/>
+        </w:rPr>
+        <w:t xml:space="preserve">When the Adventurers are defeated, the player picks one die from the highest tier of Loot Dice in their Dice Tray to carry into the next run, where it takes the place of the extra Attack Die I.</w:t>
+      </w:r>
+    </w:p>
+    <w:p>
+      <w:pPr>
+        <w:rPr/>
+      </w:pPr>
+    </w:p>
+    <w:p>
+      <w:pPr>
+        <w:ind w:left="360" w:right="390" w:firstLine="0"/>
+      </w:pPr>
+      <w:r>
+        <w:rPr>
+          <w:b w:val="1"/>
+          <w:bCs w:val="1"/>
+          <w:rtl w:val="0"/>
+        </w:rPr>
+        <w:t xml:space="preserve">Achievements. </w:t>
+      </w:r>
+      <w:r>
+        <w:rPr>
+          <w:rtl w:val="0"/>
+        </w:rPr>
+        <w:t xml:space="preserve">Lifetime milestones such as winning a run, winning with every Origin or Class, landing 10 Overkills, or defeating 100 Encounters are recorded as Achievements. They are bragging rights and never change gameplay.</w:t>
+      </w:r>
+    </w:p>
+    <w:p>
+      <w:pPr>
+        <w:rPr/>
+      </w:pPr>
+    </w:p>
+    <w:p>
+      <w:pPr>
+        <w:ind w:left="360" w:right="390" w:firstLine="0"/>
+      </w:pPr>
+      <w:r>
+        <w:rPr>
+          <w:b w:val="1"/>
+          <w:bCs w:val="1"/>
+          <w:rtl w:val="0"/>
+        </w:rPr>
+        <w:t xml:space="preserve">Run highlights. </w:t>
+      </w:r>
+      <w:r>
+        <w:rPr>
+          <w:rtl w:val="0"/>
+        </w:rPr>
+        <w:t xml:space="preserve">The end-of-run screen, win or lose, shows a Highlights card: the biggest single turn (total damage, and the foe it hit), the biggest Overkill (damage dealt past the foe's remaining Health), the longest Path (number of dice), and the number of Close Calls. A gold NEW BEST tag appears whenever one of the first three beats the player's best from earlier runs.</w:t>
+      </w:r>
+    </w:p>
+    <w:p>
+      <w:pPr>
+        <w:rPr/>
+      </w:pPr>
+    </w:p>
+    <w:p>
+      <w:pPr>
+        <w:ind w:left="360" w:right="390" w:firstLine="0"/>
+      </w:pPr>
+      <w:r>
+        <w:rPr>
+          <w:b w:val="1"/>
+          <w:bCs w:val="1"/>
+          <w:rtl w:val="0"/>
+        </w:rPr>
+        <w:t xml:space="preserve">Close calls. </w:t>
+      </w:r>
+      <w:r>
+        <w:rPr>
+          <w:rtl w:val="0"/>
+        </w:rPr>
+        <w:t xml:space="preserve">A Close Call is a turn that leaves a foe with 3 Health or less, or a kill that falls 1 to 3 damage short of an Overkill. The game calls these out (for example, "Just 2 HP left!" or "So close! 2 short of Overkill") and, while a Path is being built, shows a live hint when it would be Lethal, would reach Overkill, or is within 3 of a kill. These hints are information only and have no effect on the rules.</w:t>
+      </w:r>
+    </w:p>
+    <w:p>
+      <w:pPr>
+        <w:rPr/>
+      </w:pPr>
+    </w:p>
+    <w:p>
+      <w:pPr>
+        <w:ind w:left="360" w:right="390" w:firstLine="0"/>
+      </w:pPr>
+      <w:r>
+        <w:rPr>
+          <w:b w:val="1"/>
+          <w:bCs w:val="1"/>
+          <w:rtl w:val="0"/>
+        </w:rPr>
+        <w:t xml:space="preserve">Loot chests. </w:t>
+      </w:r>
+      <w:r>
+        <w:rPr>
+          <w:rtl w:val="0"/>
+        </w:rPr>
+        <w:t xml:space="preserve">After a victory the loot waits in a chest with one pip for each die inside it: 2 for a normal win, 3 for an Overkill or a Boss, and one more with the Lucky Coin Relic. Opening it lights the pips and reveals the dice to choose from.</w:t>
+      </w:r>
+    </w:p>
+    <w:p>
+      <w:pPr>
+        <w:rPr/>
+      </w:pPr>
     </w:p>
     <w:p>
       <w:pPr>

</xml_diff>